<commit_message>
Docs: expand the alarm-to-investigation flow
- Design doc 3.1: why order-service re-raises (Errors metric), alarm
  parameters, measured timings, and why the alert forwarder layer exists.
- Solution doc 4.3: the alert card is sent after the webhook call succeeds.
</commit_message>
<xml_diff>
--- a/docs/02-设计文档.docx
+++ b/docs/02-设计文档.docx
@@ -2637,7 +2637,7 @@
           <w:b w:val="0"/>
           <w:sz w:val="21"/>
         </w:rPr>
-        <w:t xml:space="preserve">1. 订单服务调用失败，Lambda </w:t>
+        <w:t xml:space="preserve">1. 订单服务调用失败。订单服务捕获异常后先写一条结构化错误日志（错误类型、版本、表名），再把异常重新抛出，使这次调用记为失败、计入 Lambda </w:t>
       </w:r>
       <w:r>
         <w:rPr>
@@ -2653,7 +2653,7 @@
           <w:b w:val="0"/>
           <w:sz w:val="21"/>
         </w:rPr>
-        <w:t xml:space="preserve"> 指标在 60 秒周期内 ≥ 5，CloudWatch 告警进入 ALARM，经 SNS 触发告警转换 Lambda。</w:t>
+        <w:t xml:space="preserve"> 指标。只记日志、不抛出异常时，指标不会变化，告警也不会触发。</w:t>
       </w:r>
     </w:p>
     <w:p>
@@ -2667,7 +2667,143 @@
           <w:b w:val="0"/>
           <w:sz w:val="21"/>
         </w:rPr>
-        <w:t>2. 告警转换按告警名在 DynamoDB 做条件写入（</w:t>
+        <w:t xml:space="preserve">2. CloudWatch 告警 </w:t>
+      </w:r>
+      <w:r>
+        <w:rPr>
+          <w:rFonts w:ascii="Courier New" w:hAnsi="Courier New" w:eastAsia="新宋体"/>
+          <w:b w:val="0"/>
+          <w:sz w:val="20"/>
+        </w:rPr>
+        <w:t>aiops-demo-order-service-errors</w:t>
+      </w:r>
+      <w:r>
+        <w:rPr>
+          <w:rFonts w:ascii="宋体" w:hAnsi="宋体" w:eastAsia="宋体"/>
+          <w:b w:val="0"/>
+          <w:sz w:val="21"/>
+        </w:rPr>
+        <w:t xml:space="preserve"> 进入 ALARM，经 SNS 触发告警转换 Lambda。告警参数如下：</w:t>
+      </w:r>
+    </w:p>
+    <w:p>
+      <w:pPr>
+        <w:spacing w:after="60"/>
+        <w:ind w:left="794" w:hanging="283"/>
+      </w:pPr>
+      <w:r>
+        <w:rPr>
+          <w:rFonts w:ascii="宋体" w:hAnsi="宋体" w:eastAsia="宋体"/>
+          <w:b w:val="0"/>
+          <w:sz w:val="21"/>
+        </w:rPr>
+        <w:t>◦ 指标：</w:t>
+      </w:r>
+      <w:r>
+        <w:rPr>
+          <w:rFonts w:ascii="Courier New" w:hAnsi="Courier New" w:eastAsia="新宋体"/>
+          <w:b w:val="0"/>
+          <w:sz w:val="20"/>
+        </w:rPr>
+        <w:t>AWS/Lambda</w:t>
+      </w:r>
+      <w:r>
+        <w:rPr>
+          <w:rFonts w:ascii="宋体" w:hAnsi="宋体" w:eastAsia="宋体"/>
+          <w:b w:val="0"/>
+          <w:sz w:val="21"/>
+        </w:rPr>
+        <w:t xml:space="preserve"> </w:t>
+      </w:r>
+      <w:r>
+        <w:rPr>
+          <w:rFonts w:ascii="Courier New" w:hAnsi="Courier New" w:eastAsia="新宋体"/>
+          <w:b w:val="0"/>
+          <w:sz w:val="20"/>
+        </w:rPr>
+        <w:t>Errors</w:t>
+      </w:r>
+      <w:r>
+        <w:rPr>
+          <w:rFonts w:ascii="宋体" w:hAnsi="宋体" w:eastAsia="宋体"/>
+          <w:b w:val="0"/>
+          <w:sz w:val="21"/>
+        </w:rPr>
+        <w:t>，统计方式 Sum，周期 60 秒；</w:t>
+      </w:r>
+    </w:p>
+    <w:p>
+      <w:pPr>
+        <w:spacing w:after="60"/>
+        <w:ind w:left="794" w:hanging="283"/>
+      </w:pPr>
+      <w:r>
+        <w:rPr>
+          <w:rFonts w:ascii="宋体" w:hAnsi="宋体" w:eastAsia="宋体"/>
+          <w:b w:val="0"/>
+          <w:sz w:val="21"/>
+        </w:rPr>
+        <w:t>◦ 条件：1 个数据点 ≥ 5 即进入 ALARM；缺数据按未超阈值处理（</w:t>
+      </w:r>
+      <w:r>
+        <w:rPr>
+          <w:rFonts w:ascii="Courier New" w:hAnsi="Courier New" w:eastAsia="新宋体"/>
+          <w:b w:val="0"/>
+          <w:sz w:val="20"/>
+        </w:rPr>
+        <w:t>TreatMissingData = notBreaching</w:t>
+      </w:r>
+      <w:r>
+        <w:rPr>
+          <w:rFonts w:ascii="宋体" w:hAnsi="宋体" w:eastAsia="宋体"/>
+          <w:b w:val="0"/>
+          <w:sz w:val="21"/>
+        </w:rPr>
+        <w:t>）；</w:t>
+      </w:r>
+    </w:p>
+    <w:p>
+      <w:pPr>
+        <w:spacing w:after="60"/>
+        <w:ind w:left="794" w:hanging="283"/>
+      </w:pPr>
+      <w:r>
+        <w:rPr>
+          <w:rFonts w:ascii="宋体" w:hAnsi="宋体" w:eastAsia="宋体"/>
+          <w:b w:val="0"/>
+          <w:sz w:val="21"/>
+        </w:rPr>
+        <w:t xml:space="preserve">◦ 动作：ALARM 与 OK 两种状态都发到 SNS 主题 </w:t>
+      </w:r>
+      <w:r>
+        <w:rPr>
+          <w:rFonts w:ascii="Courier New" w:hAnsi="Courier New" w:eastAsia="新宋体"/>
+          <w:b w:val="0"/>
+          <w:sz w:val="20"/>
+        </w:rPr>
+        <w:t>aiops-demo-alerts</w:t>
+      </w:r>
+      <w:r>
+        <w:rPr>
+          <w:rFonts w:ascii="宋体" w:hAnsi="宋体" w:eastAsia="宋体"/>
+          <w:b w:val="0"/>
+          <w:sz w:val="21"/>
+        </w:rPr>
+        <w:t>，告警与恢复走同一条链路。</w:t>
+      </w:r>
+    </w:p>
+    <w:p>
+      <w:pPr>
+        <w:spacing w:after="60"/>
+        <w:ind w:left="397" w:hanging="283"/>
+      </w:pPr>
+      <w:r>
+        <w:rPr>
+          <w:rFonts w:ascii="宋体" w:hAnsi="宋体" w:eastAsia="宋体"/>
+          <w:b w:val="0"/>
+          <w:sz w:val="21"/>
+        </w:rPr>
+        <w:t>3. 告警转换按告警名在 DynamoDB 做条件写入（</w:t>
       </w:r>
       <w:r>
         <w:rPr>
@@ -2697,7 +2833,7 @@
           <w:b w:val="0"/>
           <w:sz w:val="21"/>
         </w:rPr>
-        <w:t>3. 构造 Webhook 载荷（4.1），以 HMAC 签名调用 DevOps Agent Webhook，收到 HTTP 200 后推送告警卡片。</w:t>
+        <w:t>4. 构造 Webhook 载荷（4.1），以 HMAC 签名调用 DevOps Agent Webhook，收到 HTTP 200 后推送告警卡片。</w:t>
       </w:r>
     </w:p>
     <w:p>
@@ -2711,7 +2847,7 @@
           <w:b w:val="0"/>
           <w:sz w:val="21"/>
         </w:rPr>
-        <w:t xml:space="preserve">4. DevOps Agent 创建调查并发出 </w:t>
+        <w:t xml:space="preserve">5. DevOps Agent 创建调查并发出 </w:t>
       </w:r>
       <w:r>
         <w:rPr>
@@ -2741,7 +2877,7 @@
           <w:b w:val="0"/>
           <w:sz w:val="21"/>
         </w:rPr>
-        <w:t>5. Agent 按 Skill 的顺序取证：</w:t>
+        <w:t>6. Agent 按 Skill 的顺序取证：</w:t>
       </w:r>
       <w:r>
         <w:rPr>
@@ -2819,7 +2955,7 @@
           <w:b w:val="0"/>
           <w:sz w:val="21"/>
         </w:rPr>
-        <w:t xml:space="preserve">6. 调查完成，发出 </w:t>
+        <w:t xml:space="preserve">7. 调查完成，发出 </w:t>
       </w:r>
       <w:r>
         <w:rPr>
@@ -2836,6 +2972,127 @@
           <w:sz w:val="21"/>
         </w:rPr>
         <w:t xml:space="preserve"> 事件；通知 Lambda 读取摘要，推送根因卡片。</w:t>
+      </w:r>
+    </w:p>
+    <w:p>
+      <w:pPr>
+        <w:spacing w:after="80"/>
+        <w:ind w:left="0"/>
+      </w:pPr>
+      <w:r>
+        <w:rPr>
+          <w:rFonts w:ascii="宋体" w:hAnsi="宋体" w:eastAsia="宋体"/>
+          <w:b/>
+          <w:sz w:val="21"/>
+        </w:rPr>
+        <w:t>Demo 实测耗时</w:t>
+      </w:r>
+      <w:r>
+        <w:rPr>
+          <w:rFonts w:ascii="宋体" w:hAnsi="宋体" w:eastAsia="宋体"/>
+          <w:b w:val="0"/>
+          <w:sz w:val="21"/>
+        </w:rPr>
+        <w:t>（4 次演练）：注入故障后约 1.5–2 分钟告警进入 ALARM；进入 ALARM 后约 13–14 秒调查开始；调查约 6–8 分钟完成。告警耗时主要来自指标按分钟聚合、告警按 60 秒周期评估。</w:t>
+      </w:r>
+    </w:p>
+    <w:p>
+      <w:pPr>
+        <w:spacing w:after="80"/>
+        <w:ind w:left="0"/>
+      </w:pPr>
+      <w:r>
+        <w:rPr>
+          <w:rFonts w:ascii="宋体" w:hAnsi="宋体" w:eastAsia="宋体"/>
+          <w:b/>
+          <w:sz w:val="21"/>
+        </w:rPr>
+        <w:t>为什么需要告警转换这一层</w:t>
+      </w:r>
+      <w:r>
+        <w:rPr>
+          <w:rFonts w:ascii="宋体" w:hAnsi="宋体" w:eastAsia="宋体"/>
+          <w:b w:val="0"/>
+          <w:sz w:val="21"/>
+        </w:rPr>
+        <w:t>：</w:t>
+      </w:r>
+    </w:p>
+    <w:p>
+      <w:pPr>
+        <w:spacing w:after="60"/>
+        <w:ind w:left="397" w:hanging="283"/>
+      </w:pPr>
+      <w:r>
+        <w:rPr>
+          <w:rFonts w:ascii="宋体" w:hAnsi="宋体" w:eastAsia="宋体"/>
+          <w:b w:val="0"/>
+          <w:sz w:val="21"/>
+        </w:rPr>
+        <w:t>• SNS 的 HTTP/HTTPS 订阅按 SNS 自己的 JSON 格式和请求头投递通知，认证方式只有 URL 中的 Basic / Digest（</w:t>
+      </w:r>
+      <w:hyperlink r:id="rId12">
+        <w:r>
+          <w:rPr>
+            <w:rFonts w:ascii="宋体" w:hAnsi="宋体" w:eastAsia="宋体"/>
+            <w:color w:val="0563C1"/>
+            <w:sz w:val="21"/>
+            <w:u w:val="single"/>
+          </w:rPr>
+          <w:t xml:space="preserve">将 HTTP/S 端点订阅到 SNS 主题</w:t>
+        </w:r>
+      </w:hyperlink>
+      <w:r>
+        <w:rPr>
+          <w:rFonts w:ascii="宋体" w:hAnsi="宋体" w:eastAsia="宋体"/>
+          <w:b w:val="0"/>
+          <w:sz w:val="21"/>
+        </w:rPr>
+        <w:t>），生成不了 Webhook 要求的 incident 载荷和 HMAC 签名请求头，所以由 Lambda 做格式转换与签名。</w:t>
+      </w:r>
+    </w:p>
+    <w:p>
+      <w:pPr>
+        <w:spacing w:after="60"/>
+        <w:ind w:left="397" w:hanging="283"/>
+      </w:pPr>
+      <w:r>
+        <w:rPr>
+          <w:rFonts w:ascii="宋体" w:hAnsi="宋体" w:eastAsia="宋体"/>
+          <w:b w:val="0"/>
+          <w:sz w:val="21"/>
+        </w:rPr>
+        <w:t xml:space="preserve">• </w:t>
+      </w:r>
+      <w:r>
+        <w:rPr>
+          <w:rFonts w:ascii="Courier New" w:hAnsi="Courier New" w:eastAsia="新宋体"/>
+          <w:b w:val="0"/>
+          <w:sz w:val="20"/>
+        </w:rPr>
+        <w:t>description</w:t>
+      </w:r>
+      <w:r>
+        <w:rPr>
+          <w:rFonts w:ascii="宋体" w:hAnsi="宋体" w:eastAsia="宋体"/>
+          <w:b w:val="0"/>
+          <w:sz w:val="21"/>
+        </w:rPr>
+        <w:t xml:space="preserve"> 是 Agent 开始调查时的主要上下文，在这一层统一补充指标、阈值、资源维度和调查引导语；去重收敛也放在这一层，行为可控。</w:t>
+      </w:r>
+    </w:p>
+    <w:p>
+      <w:pPr>
+        <w:spacing w:after="60"/>
+        <w:ind w:left="397" w:hanging="283"/>
+      </w:pPr>
+      <w:r>
+        <w:rPr>
+          <w:rFonts w:ascii="宋体" w:hAnsi="宋体" w:eastAsia="宋体"/>
+          <w:b w:val="0"/>
+          <w:sz w:val="21"/>
+        </w:rPr>
+        <w:t>• 生产环境中，如果现有告警平台能按 4.1 的载荷格式和签名方式直接调用 Webhook，并自行去重，可以省掉这一层。</w:t>
       </w:r>
     </w:p>
     <w:p>
@@ -3233,7 +3490,7 @@
         </w:rPr>
         <w:t>（</w:t>
       </w:r>
-      <w:hyperlink r:id="rId12">
+      <w:hyperlink r:id="rId13">
         <w:r>
           <w:rPr>
             <w:rFonts w:ascii="宋体" w:hAnsi="宋体" w:eastAsia="宋体"/>
@@ -4635,7 +4892,7 @@
         </w:rPr>
         <w:t>• 写明只读替代操作：DevOps Agent 的自主调查只执行只读操作，被判定为需要审批的调用会被取消，审批只能在对话中发起（</w:t>
       </w:r>
-      <w:hyperlink r:id="rId13">
+      <w:hyperlink r:id="rId14">
         <w:r>
           <w:rPr>
             <w:rFonts w:ascii="宋体" w:hAnsi="宋体" w:eastAsia="宋体"/>
@@ -12746,7 +13003,7 @@
         </w:rPr>
         <w:t>：向同一群组发送消息的频率限制为群内机器人共享 5 QPS（</w:t>
       </w:r>
-      <w:hyperlink r:id="rId14">
+      <w:hyperlink r:id="rId15">
         <w:r>
           <w:rPr>
             <w:rFonts w:ascii="宋体" w:hAnsi="宋体" w:eastAsia="宋体"/>

</xml_diff>

<commit_message>
Add an AWS-icon architecture diagram to the design doc
- docs/diagrams/aws_architecture.py generates aws-architecture.svg from the
  official AWS Architecture Icons package (icons embedded as symbols), laid
  out by AWS Cloud / region / account / VPC boundaries.
- Shows that each Fargate task start pulls its code bundle from the S3
  artifact bucket and both container images from Amazon ECR Public.
- Design doc section 2: add it as figure 2 (sequence diagram becomes
  figure 3), note the S3 read in the component table and the ECR Public
  dependency outside the stack.
- README: list the new diagram and generator in the tree.
</commit_message>
<xml_diff>
--- a/docs/02-设计文档.docx
+++ b/docs/02-设计文档.docx
@@ -682,6 +682,20 @@
     </w:p>
     <w:p>
       <w:pPr>
+        <w:spacing w:after="80"/>
+        <w:ind w:left="0"/>
+      </w:pPr>
+      <w:r>
+        <w:rPr>
+          <w:rFonts w:ascii="宋体" w:hAnsi="宋体" w:eastAsia="宋体"/>
+          <w:b w:val="0"/>
+          <w:sz w:val="21"/>
+        </w:rPr>
+        <w:t>图 1 按功能分组说明各组件的职责与调用关系；图 2 用 AWS 架构图标，按 AWS Cloud、区域、账号、VPC 的边界画出同一套资源及其访问关系，包括长连接任务启动时对 S3 制品桶和 Amazon ECR Public 的依赖。</w:t>
+      </w:r>
+    </w:p>
+    <w:p>
+      <w:pPr>
         <w:keepNext/>
         <w:spacing w:after="40"/>
         <w:jc w:val="center"/>
@@ -737,6 +751,60 @@
     <w:p>
       <w:pPr>
         <w:keepNext/>
+        <w:spacing w:after="40"/>
+        <w:jc w:val="center"/>
+      </w:pPr>
+      <w:r>
+        <w:drawing>
+          <wp:inline xmlns:a="http://schemas.openxmlformats.org/drawingml/2006/main" xmlns:pic="http://schemas.openxmlformats.org/drawingml/2006/picture">
+            <wp:extent cx="6192000" cy="4300000"/>
+            <wp:docPr id="2" name="Picture 2"/>
+            <wp:cNvGraphicFramePr>
+              <a:graphicFrameLocks noChangeAspect="1"/>
+            </wp:cNvGraphicFramePr>
+            <a:graphic>
+              <a:graphicData uri="http://schemas.openxmlformats.org/drawingml/2006/picture">
+                <pic:pic>
+                  <pic:nvPicPr>
+                    <pic:cNvPr id="0" name="aws-architecture.png"/>
+                    <pic:cNvPicPr/>
+                  </pic:nvPicPr>
+                  <pic:blipFill>
+                    <a:blip r:embed="rId11"/>
+                    <a:stretch>
+                      <a:fillRect/>
+                    </a:stretch>
+                  </pic:blipFill>
+                  <pic:spPr>
+                    <a:xfrm>
+                      <a:off x="0" y="0"/>
+                      <a:ext cx="6192000" cy="4300000"/>
+                    </a:xfrm>
+                    <a:prstGeom prst="rect"/>
+                  </pic:spPr>
+                </pic:pic>
+              </a:graphicData>
+            </a:graphic>
+          </wp:inline>
+        </w:drawing>
+      </w:r>
+    </w:p>
+    <w:p>
+      <w:pPr>
+        <w:spacing w:after="160"/>
+        <w:jc w:val="center"/>
+      </w:pPr>
+      <w:r>
+        <w:rPr>
+          <w:rFonts w:ascii="宋体" w:hAnsi="宋体" w:eastAsia="宋体"/>
+          <w:sz w:val="18"/>
+        </w:rPr>
+        <w:t>图 2  Demo 部署架构（AWS 架构图标）</w:t>
+      </w:r>
+    </w:p>
+    <w:p>
+      <w:pPr>
+        <w:keepNext/>
         <w:spacing w:before="200" w:after="80"/>
       </w:pPr>
       <w:r>
@@ -758,9 +826,9 @@
       </w:tblPr>
       <w:tblGrid>
         <w:gridCol w:w="1508"/>
-        <w:gridCol w:w="3656"/>
-        <w:gridCol w:w="2118"/>
-        <w:gridCol w:w="2469"/>
+        <w:gridCol w:w="3196"/>
+        <w:gridCol w:w="1851"/>
+        <w:gridCol w:w="3196"/>
       </w:tblGrid>
       <w:tr>
         <w:trPr>
@@ -789,7 +857,7 @@
         </w:tc>
         <w:tc>
           <w:tcPr>
-            <w:tcW w:type="dxa" w:w="3656"/>
+            <w:tcW w:type="dxa" w:w="3196"/>
             <w:shd w:val="clear" w:color="auto" w:fill="D9E2F3"/>
           </w:tcPr>
           <w:p>
@@ -809,7 +877,7 @@
         </w:tc>
         <w:tc>
           <w:tcPr>
-            <w:tcW w:type="dxa" w:w="2118"/>
+            <w:tcW w:type="dxa" w:w="1851"/>
             <w:shd w:val="clear" w:color="auto" w:fill="D9E2F3"/>
           </w:tcPr>
           <w:p>
@@ -829,7 +897,7 @@
         </w:tc>
         <w:tc>
           <w:tcPr>
-            <w:tcW w:type="dxa" w:w="2469"/>
+            <w:tcW w:type="dxa" w:w="3196"/>
             <w:shd w:val="clear" w:color="auto" w:fill="D9E2F3"/>
           </w:tcPr>
           <w:p>
@@ -872,7 +940,7 @@
         </w:tc>
         <w:tc>
           <w:tcPr>
-            <w:tcW w:type="dxa" w:w="3656"/>
+            <w:tcW w:type="dxa" w:w="3196"/>
           </w:tcPr>
           <w:p>
             <w:pPr>
@@ -898,7 +966,7 @@
         </w:tc>
         <w:tc>
           <w:tcPr>
-            <w:tcW w:type="dxa" w:w="2118"/>
+            <w:tcW w:type="dxa" w:w="1851"/>
           </w:tcPr>
           <w:p>
             <w:pPr>
@@ -916,7 +984,7 @@
         </w:tc>
         <w:tc>
           <w:tcPr>
-            <w:tcW w:type="dxa" w:w="2469"/>
+            <w:tcW w:type="dxa" w:w="3196"/>
           </w:tcPr>
           <w:p>
             <w:pPr>
@@ -957,7 +1025,7 @@
         </w:tc>
         <w:tc>
           <w:tcPr>
-            <w:tcW w:type="dxa" w:w="3656"/>
+            <w:tcW w:type="dxa" w:w="3196"/>
           </w:tcPr>
           <w:p>
             <w:pPr>
@@ -991,7 +1059,7 @@
         </w:tc>
         <w:tc>
           <w:tcPr>
-            <w:tcW w:type="dxa" w:w="2118"/>
+            <w:tcW w:type="dxa" w:w="1851"/>
           </w:tcPr>
           <w:p>
             <w:pPr>
@@ -1009,7 +1077,7 @@
         </w:tc>
         <w:tc>
           <w:tcPr>
-            <w:tcW w:type="dxa" w:w="2469"/>
+            <w:tcW w:type="dxa" w:w="3196"/>
           </w:tcPr>
           <w:p>
             <w:pPr>
@@ -1058,7 +1126,7 @@
         </w:tc>
         <w:tc>
           <w:tcPr>
-            <w:tcW w:type="dxa" w:w="3656"/>
+            <w:tcW w:type="dxa" w:w="3196"/>
           </w:tcPr>
           <w:p>
             <w:pPr>
@@ -1084,7 +1152,7 @@
         </w:tc>
         <w:tc>
           <w:tcPr>
-            <w:tcW w:type="dxa" w:w="2118"/>
+            <w:tcW w:type="dxa" w:w="1851"/>
           </w:tcPr>
           <w:p>
             <w:pPr>
@@ -1102,7 +1170,7 @@
         </w:tc>
         <w:tc>
           <w:tcPr>
-            <w:tcW w:type="dxa" w:w="2469"/>
+            <w:tcW w:type="dxa" w:w="3196"/>
           </w:tcPr>
           <w:p>
             <w:pPr>
@@ -1143,7 +1211,7 @@
         </w:tc>
         <w:tc>
           <w:tcPr>
-            <w:tcW w:type="dxa" w:w="3656"/>
+            <w:tcW w:type="dxa" w:w="3196"/>
           </w:tcPr>
           <w:p>
             <w:pPr>
@@ -1185,7 +1253,7 @@
         </w:tc>
         <w:tc>
           <w:tcPr>
-            <w:tcW w:type="dxa" w:w="2118"/>
+            <w:tcW w:type="dxa" w:w="1851"/>
           </w:tcPr>
           <w:p>
             <w:pPr>
@@ -1203,7 +1271,7 @@
         </w:tc>
         <w:tc>
           <w:tcPr>
-            <w:tcW w:type="dxa" w:w="2469"/>
+            <w:tcW w:type="dxa" w:w="3196"/>
           </w:tcPr>
           <w:p>
             <w:pPr>
@@ -1244,7 +1312,7 @@
         </w:tc>
         <w:tc>
           <w:tcPr>
-            <w:tcW w:type="dxa" w:w="3656"/>
+            <w:tcW w:type="dxa" w:w="3196"/>
           </w:tcPr>
           <w:p>
             <w:pPr>
@@ -1262,7 +1330,7 @@
         </w:tc>
         <w:tc>
           <w:tcPr>
-            <w:tcW w:type="dxa" w:w="2118"/>
+            <w:tcW w:type="dxa" w:w="1851"/>
           </w:tcPr>
           <w:p>
             <w:pPr>
@@ -1280,7 +1348,7 @@
         </w:tc>
         <w:tc>
           <w:tcPr>
-            <w:tcW w:type="dxa" w:w="2469"/>
+            <w:tcW w:type="dxa" w:w="3196"/>
           </w:tcPr>
           <w:p>
             <w:pPr>
@@ -1321,7 +1389,7 @@
         </w:tc>
         <w:tc>
           <w:tcPr>
-            <w:tcW w:type="dxa" w:w="3656"/>
+            <w:tcW w:type="dxa" w:w="3196"/>
           </w:tcPr>
           <w:p>
             <w:pPr>
@@ -1339,7 +1407,7 @@
         </w:tc>
         <w:tc>
           <w:tcPr>
-            <w:tcW w:type="dxa" w:w="2118"/>
+            <w:tcW w:type="dxa" w:w="1851"/>
           </w:tcPr>
           <w:p>
             <w:pPr>
@@ -1357,7 +1425,7 @@
         </w:tc>
         <w:tc>
           <w:tcPr>
-            <w:tcW w:type="dxa" w:w="2469"/>
+            <w:tcW w:type="dxa" w:w="3196"/>
           </w:tcPr>
           <w:p>
             <w:pPr>
@@ -1398,7 +1466,7 @@
         </w:tc>
         <w:tc>
           <w:tcPr>
-            <w:tcW w:type="dxa" w:w="3656"/>
+            <w:tcW w:type="dxa" w:w="3196"/>
           </w:tcPr>
           <w:p>
             <w:pPr>
@@ -1424,7 +1492,7 @@
         </w:tc>
         <w:tc>
           <w:tcPr>
-            <w:tcW w:type="dxa" w:w="2118"/>
+            <w:tcW w:type="dxa" w:w="1851"/>
           </w:tcPr>
           <w:p>
             <w:pPr>
@@ -1442,7 +1510,7 @@
         </w:tc>
         <w:tc>
           <w:tcPr>
-            <w:tcW w:type="dxa" w:w="2469"/>
+            <w:tcW w:type="dxa" w:w="3196"/>
           </w:tcPr>
           <w:p>
             <w:pPr>
@@ -1483,7 +1551,7 @@
         </w:tc>
         <w:tc>
           <w:tcPr>
-            <w:tcW w:type="dxa" w:w="3656"/>
+            <w:tcW w:type="dxa" w:w="3196"/>
           </w:tcPr>
           <w:p>
             <w:pPr>
@@ -1509,7 +1577,7 @@
         </w:tc>
         <w:tc>
           <w:tcPr>
-            <w:tcW w:type="dxa" w:w="2118"/>
+            <w:tcW w:type="dxa" w:w="1851"/>
           </w:tcPr>
           <w:p>
             <w:pPr>
@@ -1527,7 +1595,7 @@
         </w:tc>
         <w:tc>
           <w:tcPr>
-            <w:tcW w:type="dxa" w:w="2469"/>
+            <w:tcW w:type="dxa" w:w="3196"/>
           </w:tcPr>
           <w:p>
             <w:pPr>
@@ -1568,7 +1636,7 @@
         </w:tc>
         <w:tc>
           <w:tcPr>
-            <w:tcW w:type="dxa" w:w="3656"/>
+            <w:tcW w:type="dxa" w:w="3196"/>
           </w:tcPr>
           <w:p>
             <w:pPr>
@@ -1610,7 +1678,7 @@
         </w:tc>
         <w:tc>
           <w:tcPr>
-            <w:tcW w:type="dxa" w:w="2118"/>
+            <w:tcW w:type="dxa" w:w="1851"/>
           </w:tcPr>
           <w:p>
             <w:pPr>
@@ -1628,7 +1696,7 @@
         </w:tc>
         <w:tc>
           <w:tcPr>
-            <w:tcW w:type="dxa" w:w="2469"/>
+            <w:tcW w:type="dxa" w:w="3196"/>
           </w:tcPr>
           <w:p>
             <w:pPr>
@@ -1669,7 +1737,7 @@
         </w:tc>
         <w:tc>
           <w:tcPr>
-            <w:tcW w:type="dxa" w:w="3656"/>
+            <w:tcW w:type="dxa" w:w="3196"/>
           </w:tcPr>
           <w:p>
             <w:pPr>
@@ -1687,7 +1755,7 @@
         </w:tc>
         <w:tc>
           <w:tcPr>
-            <w:tcW w:type="dxa" w:w="2118"/>
+            <w:tcW w:type="dxa" w:w="1851"/>
           </w:tcPr>
           <w:p>
             <w:pPr>
@@ -1705,7 +1773,7 @@
         </w:tc>
         <w:tc>
           <w:tcPr>
-            <w:tcW w:type="dxa" w:w="2469"/>
+            <w:tcW w:type="dxa" w:w="3196"/>
           </w:tcPr>
           <w:p>
             <w:pPr>
@@ -1746,7 +1814,7 @@
         </w:tc>
         <w:tc>
           <w:tcPr>
-            <w:tcW w:type="dxa" w:w="3656"/>
+            <w:tcW w:type="dxa" w:w="3196"/>
           </w:tcPr>
           <w:p>
             <w:pPr>
@@ -1772,7 +1840,7 @@
         </w:tc>
         <w:tc>
           <w:tcPr>
-            <w:tcW w:type="dxa" w:w="2118"/>
+            <w:tcW w:type="dxa" w:w="1851"/>
           </w:tcPr>
           <w:p>
             <w:pPr>
@@ -1790,7 +1858,7 @@
         </w:tc>
         <w:tc>
           <w:tcPr>
-            <w:tcW w:type="dxa" w:w="2469"/>
+            <w:tcW w:type="dxa" w:w="3196"/>
           </w:tcPr>
           <w:p>
             <w:pPr>
@@ -1831,7 +1899,7 @@
         </w:tc>
         <w:tc>
           <w:tcPr>
-            <w:tcW w:type="dxa" w:w="3656"/>
+            <w:tcW w:type="dxa" w:w="3196"/>
           </w:tcPr>
           <w:p>
             <w:pPr>
@@ -1857,7 +1925,7 @@
         </w:tc>
         <w:tc>
           <w:tcPr>
-            <w:tcW w:type="dxa" w:w="2118"/>
+            <w:tcW w:type="dxa" w:w="1851"/>
           </w:tcPr>
           <w:p>
             <w:pPr>
@@ -1875,7 +1943,7 @@
         </w:tc>
         <w:tc>
           <w:tcPr>
-            <w:tcW w:type="dxa" w:w="2469"/>
+            <w:tcW w:type="dxa" w:w="3196"/>
           </w:tcPr>
           <w:p>
             <w:pPr>
@@ -1916,7 +1984,7 @@
         </w:tc>
         <w:tc>
           <w:tcPr>
-            <w:tcW w:type="dxa" w:w="3656"/>
+            <w:tcW w:type="dxa" w:w="3196"/>
           </w:tcPr>
           <w:p>
             <w:pPr>
@@ -1958,7 +2026,7 @@
         </w:tc>
         <w:tc>
           <w:tcPr>
-            <w:tcW w:type="dxa" w:w="2118"/>
+            <w:tcW w:type="dxa" w:w="1851"/>
           </w:tcPr>
           <w:p>
             <w:pPr>
@@ -1976,7 +2044,7 @@
         </w:tc>
         <w:tc>
           <w:tcPr>
-            <w:tcW w:type="dxa" w:w="2469"/>
+            <w:tcW w:type="dxa" w:w="3196"/>
           </w:tcPr>
           <w:p>
             <w:pPr>
@@ -2017,7 +2085,7 @@
         </w:tc>
         <w:tc>
           <w:tcPr>
-            <w:tcW w:type="dxa" w:w="3656"/>
+            <w:tcW w:type="dxa" w:w="3196"/>
           </w:tcPr>
           <w:p>
             <w:pPr>
@@ -2043,7 +2111,7 @@
         </w:tc>
         <w:tc>
           <w:tcPr>
-            <w:tcW w:type="dxa" w:w="2118"/>
+            <w:tcW w:type="dxa" w:w="1851"/>
           </w:tcPr>
           <w:p>
             <w:pPr>
@@ -2061,7 +2129,7 @@
         </w:tc>
         <w:tc>
           <w:tcPr>
-            <w:tcW w:type="dxa" w:w="2469"/>
+            <w:tcW w:type="dxa" w:w="3196"/>
           </w:tcPr>
           <w:p>
             <w:pPr>
@@ -2102,7 +2170,7 @@
         </w:tc>
         <w:tc>
           <w:tcPr>
-            <w:tcW w:type="dxa" w:w="3656"/>
+            <w:tcW w:type="dxa" w:w="3196"/>
           </w:tcPr>
           <w:p>
             <w:pPr>
@@ -2120,7 +2188,7 @@
         </w:tc>
         <w:tc>
           <w:tcPr>
-            <w:tcW w:type="dxa" w:w="2118"/>
+            <w:tcW w:type="dxa" w:w="1851"/>
           </w:tcPr>
           <w:p>
             <w:pPr>
@@ -2138,19 +2206,19 @@
         </w:tc>
         <w:tc>
           <w:tcPr>
-            <w:tcW w:type="dxa" w:w="2469"/>
-          </w:tcPr>
-          <w:p>
-            <w:pPr>
-              <w:spacing w:after="0"/>
-            </w:pPr>
-            <w:r>
-              <w:rPr>
-                <w:rFonts w:ascii="宋体" w:hAnsi="宋体" w:eastAsia="宋体"/>
-                <w:b w:val="0"/>
-                <w:sz w:val="18"/>
-              </w:rPr>
-              <w:t>Lambda 代码包、es-mock 与长连接客户端的 zip</w:t>
+            <w:tcW w:type="dxa" w:w="3196"/>
+          </w:tcPr>
+          <w:p>
+            <w:pPr>
+              <w:spacing w:after="0"/>
+            </w:pPr>
+            <w:r>
+              <w:rPr>
+                <w:rFonts w:ascii="宋体" w:hAnsi="宋体" w:eastAsia="宋体"/>
+                <w:b w:val="0"/>
+                <w:sz w:val="18"/>
+              </w:rPr>
+              <w:t>Lambda 代码包、es-mock 与长连接客户端的 zip；长连接任务每次启动时从这里读取代码包</w:t>
             </w:r>
           </w:p>
         </w:tc>
@@ -2173,6 +2241,52 @@
           <w:sz w:val="21"/>
         </w:rPr>
         <w:t>栈外由 DevOps Agent 管理的部分：Agent Space、HMAC Webhook、两个 MCP 注册及其与 Agent Space 的关联、Skill。</w:t>
+      </w:r>
+    </w:p>
+    <w:p>
+      <w:pPr>
+        <w:spacing w:after="80"/>
+        <w:ind w:left="0"/>
+      </w:pPr>
+      <w:r>
+        <w:rPr>
+          <w:rFonts w:ascii="宋体" w:hAnsi="宋体" w:eastAsia="宋体"/>
+          <w:b w:val="0"/>
+          <w:sz w:val="21"/>
+        </w:rPr>
+        <w:t>栈外的运行时依赖：长连接任务每次启动时从 Amazon ECR Public 拉取两个公共镜像（</w:t>
+      </w:r>
+      <w:r>
+        <w:rPr>
+          <w:rFonts w:ascii="Courier New" w:hAnsi="Courier New" w:eastAsia="新宋体"/>
+          <w:b w:val="0"/>
+          <w:sz w:val="20"/>
+        </w:rPr>
+        <w:t>aws-cli</w:t>
+      </w:r>
+      <w:r>
+        <w:rPr>
+          <w:rFonts w:ascii="宋体" w:hAnsi="宋体" w:eastAsia="宋体"/>
+          <w:b w:val="0"/>
+          <w:sz w:val="21"/>
+        </w:rPr>
+        <w:t>、</w:t>
+      </w:r>
+      <w:r>
+        <w:rPr>
+          <w:rFonts w:ascii="Courier New" w:hAnsi="Courier New" w:eastAsia="新宋体"/>
+          <w:b w:val="0"/>
+          <w:sz w:val="20"/>
+        </w:rPr>
+        <w:t>python:3.12-slim</w:t>
+      </w:r>
+      <w:r>
+        <w:rPr>
+          <w:rFonts w:ascii="宋体" w:hAnsi="宋体" w:eastAsia="宋体"/>
+          <w:b w:val="0"/>
+          <w:sz w:val="21"/>
+        </w:rPr>
+        <w:t>，均按 digest 锁定）。生产环境建议把客户端打成自有镜像放入私有 Amazon ECR，去掉对 S3 代码包和 ECR Public 的启动依赖。</w:t>
       </w:r>
     </w:p>
     <w:p>
@@ -2568,7 +2682,7 @@
         <w:drawing>
           <wp:inline xmlns:a="http://schemas.openxmlformats.org/drawingml/2006/main" xmlns:pic="http://schemas.openxmlformats.org/drawingml/2006/picture">
             <wp:extent cx="6192000" cy="4157486"/>
-            <wp:docPr id="2" name="Picture 2"/>
+            <wp:docPr id="3" name="Picture 3"/>
             <wp:cNvGraphicFramePr>
               <a:graphicFrameLocks noChangeAspect="1"/>
             </wp:cNvGraphicFramePr>
@@ -2580,7 +2694,7 @@
                     <pic:cNvPicPr/>
                   </pic:nvPicPr>
                   <pic:blipFill>
-                    <a:blip r:embed="rId11"/>
+                    <a:blip r:embed="rId12"/>
                     <a:stretch>
                       <a:fillRect/>
                     </a:stretch>
@@ -2609,7 +2723,7 @@
           <w:rFonts w:ascii="宋体" w:hAnsi="宋体" w:eastAsia="宋体"/>
           <w:sz w:val="18"/>
         </w:rPr>
-        <w:t>图 2  关键交互时序</w:t>
+        <w:t>图 3  关键交互时序</w:t>
       </w:r>
     </w:p>
     <w:p>
@@ -3031,7 +3145,7 @@
         </w:rPr>
         <w:t>• SNS 的 HTTP/HTTPS 订阅按 SNS 自己的 JSON 格式和请求头投递通知，认证方式只有 URL 中的 Basic / Digest（</w:t>
       </w:r>
-      <w:hyperlink r:id="rId12">
+      <w:hyperlink r:id="rId13">
         <w:r>
           <w:rPr>
             <w:rFonts w:ascii="宋体" w:hAnsi="宋体" w:eastAsia="宋体"/>
@@ -3490,7 +3604,7 @@
         </w:rPr>
         <w:t>（</w:t>
       </w:r>
-      <w:hyperlink r:id="rId13">
+      <w:hyperlink r:id="rId14">
         <w:r>
           <w:rPr>
             <w:rFonts w:ascii="宋体" w:hAnsi="宋体" w:eastAsia="宋体"/>
@@ -4892,7 +5006,7 @@
         </w:rPr>
         <w:t>• 写明只读替代操作：DevOps Agent 的自主调查只执行只读操作，被判定为需要审批的调用会被取消，审批只能在对话中发起（</w:t>
       </w:r>
-      <w:hyperlink r:id="rId14">
+      <w:hyperlink r:id="rId15">
         <w:r>
           <w:rPr>
             <w:rFonts w:ascii="宋体" w:hAnsi="宋体" w:eastAsia="宋体"/>
@@ -13003,7 +13117,7 @@
         </w:rPr>
         <w:t>：向同一群组发送消息的频率限制为群内机器人共享 5 QPS（</w:t>
       </w:r>
-      <w:hyperlink r:id="rId15">
+      <w:hyperlink r:id="rId16">
         <w:r>
           <w:rPr>
             <w:rFonts w:ascii="宋体" w:hAnsi="宋体" w:eastAsia="宋体"/>

</xml_diff>

<commit_message>
Skill: query CloudTrail by resource name; neutral stack and function descriptions
- SKILL.md step 2: query CloudTrail by ResourceName; Lambda event names carry an API version suffix (UpdateFunctionConfiguration20150331v2), so exact event-name filters return nothing.
- template.yaml: neutral stack and order-service descriptions, so the investigation does not read 'fault injection' from CloudTrail.
- Deployment guide: remove the old Skill zip before repackaging; design doc notes the CloudTrail event-name suffix.
</commit_message>
<xml_diff>
--- a/docs/02-设计文档.docx
+++ b/docs/02-设计文档.docx
@@ -5087,7 +5087,39 @@
           <w:b w:val="0"/>
           <w:sz w:val="21"/>
         </w:rPr>
-        <w:t>、Nexus 部署记录）。</w:t>
+        <w:t xml:space="preserve">、Nexus 部署记录）。子任务按资源名查询而不按事件名过滤：Lambda 在 CloudTrail 中的事件名带 API 版本后缀（如 </w:t>
+      </w:r>
+      <w:r>
+        <w:rPr>
+          <w:rFonts w:ascii="Courier New" w:hAnsi="Courier New" w:eastAsia="新宋体"/>
+          <w:b w:val="0"/>
+          <w:sz w:val="20"/>
+        </w:rPr>
+        <w:t>UpdateFunctionConfiguration20150331v2</w:t>
+      </w:r>
+      <w:r>
+        <w:rPr>
+          <w:rFonts w:ascii="宋体" w:hAnsi="宋体" w:eastAsia="宋体"/>
+          <w:b w:val="0"/>
+          <w:sz w:val="21"/>
+        </w:rPr>
+        <w:t xml:space="preserve">），按 </w:t>
+      </w:r>
+      <w:r>
+        <w:rPr>
+          <w:rFonts w:ascii="Courier New" w:hAnsi="Courier New" w:eastAsia="新宋体"/>
+          <w:b w:val="0"/>
+          <w:sz w:val="20"/>
+        </w:rPr>
+        <w:t>UpdateFunctionConfiguration</w:t>
+      </w:r>
+      <w:r>
+        <w:rPr>
+          <w:rFonts w:ascii="宋体" w:hAnsi="宋体" w:eastAsia="宋体"/>
+          <w:b w:val="0"/>
+          <w:sz w:val="21"/>
+        </w:rPr>
+        <w:t xml:space="preserve"> 精确过滤会查不到。</w:t>
       </w:r>
     </w:p>
     <w:p>

</xml_diff>